<commit_message>
Update v35: reviewer Q&A supplementary (eAppendix 14), BF simulator inline-animation fix, threshold-sweep & single-condition walkthrough artifacts
</commit_message>
<xml_diff>
--- a/paper/manuscript_v35.docx
+++ b/paper/manuscript_v35.docx
@@ -7985,43 +7985,31 @@
         </m:r>
       </m:oMath>
       <w:r>
-        <w:t xml:space="preserve">, the empirical null estimate is too imprecise. We recommend at least 8-10 controls with adequate event counts.</w:t>
-      </w:r>
-    </w:p>
-    <w:p>
-      <w:pPr>
-        <w:pStyle w:val="BodyText"/>
-      </w:pPr>
-      <w:r>
-        <w:rPr>
-          <w:b/>
-          <w:bCs/>
-        </w:rPr>
-        <w:t xml:space="preserve">Non-exchangeable controls.</w:t>
-      </w:r>
-      <w:r>
-        <w:t xml:space="preserve"> </w:t>
-      </w:r>
-      <w:r>
-        <w:t xml:space="preserve">If the negative controls are affected by outcome-specific mechanisms that do not operate on the primary endpoint, the estimated bias distribution will misrepresent the bias affecting the primary analysis.</w:t>
-      </w:r>
-    </w:p>
-    <w:p>
-      <w:pPr>
-        <w:pStyle w:val="BodyText"/>
-      </w:pPr>
-      <w:r>
-        <w:rPr>
-          <w:b/>
-          <w:bCs/>
-        </w:rPr>
-        <w:t xml:space="preserve">Heterogeneous bias directions.</w:t>
-      </w:r>
-      <w:r>
-        <w:t xml:space="preserve"> </w:t>
-      </w:r>
-      <w:r>
-        <w:t xml:space="preserve">The empirical null model assumes the negative controls share a common bias direction. Opposite-direction bias attenuates</w:t>
+        <w:t xml:space="preserve">, the empirical null estimate is too imprecise. We recommend at least 8-10 controls with adequate event counts. The empirical null is fit by maximum likelihood in a hierarchical normal model (γ̂_k ~ N(μ_B, τ̂_k² + σ_B²);</w:t>
+      </w:r>
+      <w:r>
+        <w:t xml:space="preserve"> </w:t>
+      </w:r>
+      <w:r>
+        <w:rPr>
+          <w:rStyle w:val="VerbatimChar"/>
+        </w:rPr>
+        <w:t xml:space="preserve">fitNull</w:t>
+      </w:r>
+      <w:r>
+        <w:t xml:space="preserve"> </w:t>
+      </w:r>
+      <w:r>
+        <w:t xml:space="preserve">of EmpiricalCalibration</w:t>
+      </w:r>
+      <w:r>
+        <w:rPr>
+          <w:vertAlign w:val="superscript"/>
+        </w:rPr>
+        <w:t xml:space="preserve">11</w:t>
+      </w:r>
+      <w:r>
+        <w:t xml:space="preserve">) and the calibrated p-value is computed by plug-in, treating</w:t>
       </w:r>
       <w:r>
         <w:t xml:space="preserve"> </w:t>
@@ -8051,7 +8039,285 @@
         <w:t xml:space="preserve"> </w:t>
       </w:r>
       <w:r>
-        <w:t xml:space="preserve">toward zero, and BF becomes optimistic.</w:t>
+        <w:t xml:space="preserve">and</w:t>
+      </w:r>
+      <w:r>
+        <w:t xml:space="preserve"> </w:t>
+      </w:r>
+      <m:oMath>
+        <m:sSub>
+          <m:e>
+            <m:acc>
+              <m:accPr>
+                <m:chr m:val="̂"/>
+              </m:accPr>
+              <m:e>
+                <m:r>
+                  <m:t>σ</m:t>
+                </m:r>
+              </m:e>
+            </m:acc>
+          </m:e>
+          <m:sub>
+            <m:r>
+              <m:t>B</m:t>
+            </m:r>
+          </m:sub>
+        </m:sSub>
+      </m:oMath>
+      <w:r>
+        <w:t xml:space="preserve"> </w:t>
+      </w:r>
+      <w:r>
+        <w:t xml:space="preserve">as known; with</w:t>
+      </w:r>
+      <w:r>
+        <w:t xml:space="preserve"> </w:t>
+      </w:r>
+      <m:oMath>
+        <m:r>
+          <m:t>K</m:t>
+        </m:r>
+        <m:r>
+          <m:rPr>
+            <m:sty m:val="p"/>
+          </m:rPr>
+          <m:t>=</m:t>
+        </m:r>
+        <m:r>
+          <m:t>12</m:t>
+        </m:r>
+      </m:oMath>
+      <w:r>
+        <w:t xml:space="preserve"> </w:t>
+      </w:r>
+      <w:r>
+        <w:t xml:space="preserve">the uncertainty of these parameters is not negligible. A targeted parametric simulation (2000 replicates per K, using the actual</w:t>
+      </w:r>
+      <w:r>
+        <w:t xml:space="preserve"> </w:t>
+      </w:r>
+      <m:oMath>
+        <m:sSub>
+          <m:e>
+            <m:acc>
+              <m:accPr>
+                <m:chr m:val="̂"/>
+              </m:accPr>
+              <m:e>
+                <m:r>
+                  <m:t>μ</m:t>
+                </m:r>
+              </m:e>
+            </m:acc>
+          </m:e>
+          <m:sub>
+            <m:r>
+              <m:t>B</m:t>
+            </m:r>
+          </m:sub>
+        </m:sSub>
+        <m:r>
+          <m:rPr>
+            <m:sty m:val="p"/>
+          </m:rPr>
+          <m:t>=</m:t>
+        </m:r>
+        <m:r>
+          <m:rPr>
+            <m:sty m:val="p"/>
+          </m:rPr>
+          <m:t>−</m:t>
+        </m:r>
+        <m:r>
+          <m:t>0.190</m:t>
+        </m:r>
+      </m:oMath>
+      <w:r>
+        <w:t xml:space="preserve">,</w:t>
+      </w:r>
+      <w:r>
+        <w:t xml:space="preserve"> </w:t>
+      </w:r>
+      <m:oMath>
+        <m:sSub>
+          <m:e>
+            <m:acc>
+              <m:accPr>
+                <m:chr m:val="̂"/>
+              </m:accPr>
+              <m:e>
+                <m:r>
+                  <m:t>σ</m:t>
+                </m:r>
+              </m:e>
+            </m:acc>
+          </m:e>
+          <m:sub>
+            <m:r>
+              <m:t>B</m:t>
+            </m:r>
+          </m:sub>
+        </m:sSub>
+        <m:r>
+          <m:rPr>
+            <m:sty m:val="p"/>
+          </m:rPr>
+          <m:t>=</m:t>
+        </m:r>
+        <m:r>
+          <m:t>0.068</m:t>
+        </m:r>
+      </m:oMath>
+      <w:r>
+        <w:t xml:space="preserve"> </w:t>
+      </w:r>
+      <w:r>
+        <w:t xml:space="preserve">and the 12 actual control standard errors from this study; full protocol in eAppendix 13) found that the plug-in calibrated p-value’s empirical Type I error at</w:t>
+      </w:r>
+      <w:r>
+        <w:t xml:space="preserve"> </w:t>
+      </w:r>
+      <m:oMath>
+        <m:r>
+          <m:t>α</m:t>
+        </m:r>
+        <m:r>
+          <m:rPr>
+            <m:sty m:val="p"/>
+          </m:rPr>
+          <m:t>=</m:t>
+        </m:r>
+        <m:r>
+          <m:t>0.05</m:t>
+        </m:r>
+      </m:oMath>
+      <w:r>
+        <w:t xml:space="preserve"> </w:t>
+      </w:r>
+      <w:r>
+        <w:t xml:space="preserve">reached 11.4% at</w:t>
+      </w:r>
+      <w:r>
+        <w:t xml:space="preserve"> </w:t>
+      </w:r>
+      <m:oMath>
+        <m:r>
+          <m:t>K</m:t>
+        </m:r>
+        <m:r>
+          <m:rPr>
+            <m:sty m:val="p"/>
+          </m:rPr>
+          <m:t>=</m:t>
+        </m:r>
+        <m:r>
+          <m:t>12</m:t>
+        </m:r>
+      </m:oMath>
+      <w:r>
+        <w:t xml:space="preserve"> </w:t>
+      </w:r>
+      <w:r>
+        <w:t xml:space="preserve">(versus 6.8% at</w:t>
+      </w:r>
+      <w:r>
+        <w:t xml:space="preserve"> </w:t>
+      </w:r>
+      <m:oMath>
+        <m:r>
+          <m:t>K</m:t>
+        </m:r>
+        <m:r>
+          <m:rPr>
+            <m:sty m:val="p"/>
+          </m:rPr>
+          <m:t>=</m:t>
+        </m:r>
+        <m:r>
+          <m:t>45</m:t>
+        </m:r>
+      </m:oMath>
+      <w:r>
+        <w:t xml:space="preserve"> </w:t>
+      </w:r>
+      <w:r>
+        <w:t xml:space="preserve">and 5.4% at</w:t>
+      </w:r>
+      <w:r>
+        <w:t xml:space="preserve"> </w:t>
+      </w:r>
+      <m:oMath>
+        <m:r>
+          <m:t>K</m:t>
+        </m:r>
+        <m:r>
+          <m:rPr>
+            <m:sty m:val="p"/>
+          </m:rPr>
+          <m:t>=</m:t>
+        </m:r>
+        <m:r>
+          <m:t>100</m:t>
+        </m:r>
+      </m:oMath>
+      <w:r>
+        <w:t xml:space="preserve">); a t-predictive reference distribution with</w:t>
+      </w:r>
+      <w:r>
+        <w:t xml:space="preserve"> </w:t>
+      </w:r>
+      <m:oMath>
+        <m:r>
+          <m:t>K</m:t>
+        </m:r>
+        <m:r>
+          <m:rPr>
+            <m:sty m:val="p"/>
+          </m:rPr>
+          <m:t>−</m:t>
+        </m:r>
+        <m:r>
+          <m:t>2</m:t>
+        </m:r>
+      </m:oMath>
+      <w:r>
+        <w:t xml:space="preserve"> </w:t>
+      </w:r>
+      <w:r>
+        <w:t xml:space="preserve">degrees of freedom</w:t>
+      </w:r>
+      <w:r>
+        <w:rPr>
+          <w:vertAlign w:val="superscript"/>
+        </w:rPr>
+        <w:t xml:space="preserve">22</w:t>
+      </w:r>
+      <w:r>
+        <w:t xml:space="preserve"> </w:t>
+      </w:r>
+      <w:r>
+        <w:t xml:space="preserve">restored Type I error to 6.6% at</w:t>
+      </w:r>
+      <w:r>
+        <w:t xml:space="preserve"> </w:t>
+      </w:r>
+      <m:oMath>
+        <m:r>
+          <m:t>K</m:t>
+        </m:r>
+        <m:r>
+          <m:rPr>
+            <m:sty m:val="p"/>
+          </m:rPr>
+          <m:t>=</m:t>
+        </m:r>
+        <m:r>
+          <m:t>12</m:t>
+        </m:r>
+      </m:oMath>
+      <w:r>
+        <w:t xml:space="preserve">. The two case-study conclusions are robust under both approaches (see Limitations below).</w:t>
       </w:r>
     </w:p>
     <w:p>
@@ -8063,6 +8329,72 @@
           <w:b/>
           <w:bCs/>
         </w:rPr>
+        <w:t xml:space="preserve">Non-exchangeable controls.</w:t>
+      </w:r>
+      <w:r>
+        <w:t xml:space="preserve"> </w:t>
+      </w:r>
+      <w:r>
+        <w:t xml:space="preserve">If the negative controls are affected by outcome-specific mechanisms that do not operate on the primary endpoint, the estimated bias distribution will misrepresent the bias affecting the primary analysis.</w:t>
+      </w:r>
+    </w:p>
+    <w:p>
+      <w:pPr>
+        <w:pStyle w:val="BodyText"/>
+      </w:pPr>
+      <w:r>
+        <w:rPr>
+          <w:b/>
+          <w:bCs/>
+        </w:rPr>
+        <w:t xml:space="preserve">Heterogeneous bias directions.</w:t>
+      </w:r>
+      <w:r>
+        <w:t xml:space="preserve"> </w:t>
+      </w:r>
+      <w:r>
+        <w:t xml:space="preserve">The empirical null model assumes the negative controls share a common bias direction. Opposite-direction bias attenuates</w:t>
+      </w:r>
+      <w:r>
+        <w:t xml:space="preserve"> </w:t>
+      </w:r>
+      <m:oMath>
+        <m:sSub>
+          <m:e>
+            <m:acc>
+              <m:accPr>
+                <m:chr m:val="̂"/>
+              </m:accPr>
+              <m:e>
+                <m:r>
+                  <m:t>μ</m:t>
+                </m:r>
+              </m:e>
+            </m:acc>
+          </m:e>
+          <m:sub>
+            <m:r>
+              <m:t>B</m:t>
+            </m:r>
+          </m:sub>
+        </m:sSub>
+      </m:oMath>
+      <w:r>
+        <w:t xml:space="preserve"> </w:t>
+      </w:r>
+      <w:r>
+        <w:t xml:space="preserve">toward zero, and BF becomes optimistic.</w:t>
+      </w:r>
+    </w:p>
+    <w:p>
+      <w:pPr>
+        <w:pStyle w:val="BodyText"/>
+      </w:pPr>
+      <w:r>
+        <w:rPr>
+          <w:b/>
+          <w:bCs/>
+        </w:rPr>
         <w:t xml:space="preserve">Small residual effects after calibration.</w:t>
       </w:r>
       <w:r>
@@ -8155,6 +8487,77 @@
       </w:pPr>
       <w:r>
         <w:t xml:space="preserve">Fourth, the negative control set has known limitations. Some controls share overlapping outcome definitions (the infection composite encompasses urinary tract infection and cellulitis), which reduces the effective number of independent controls. The fall control may carry a causal pathway through beta-blocker-induced bradycardia, although its observed protective association suggests confounding dominance. The leave-one-out analysis in which fall was excluded kept BF at 0.98, well above 0.5, so the primary conclusion is unchanged when this imperfect control is removed. The GDMT comparison uses the same 12 negative controls as the beta-blocker analysis; since GDMT spans multiple drug classes, its bias structure may differ, and an independent control set would strengthen the comparison.</w:t>
+      </w:r>
+    </w:p>
+    <w:p>
+      <w:pPr>
+        <w:pStyle w:val="BodyText"/>
+      </w:pPr>
+      <w:r>
+        <w:t xml:space="preserve">Fifth, the empirical null was estimated from only</w:t>
+      </w:r>
+      <w:r>
+        <w:t xml:space="preserve"> </w:t>
+      </w:r>
+      <m:oMath>
+        <m:r>
+          <m:t>K</m:t>
+        </m:r>
+        <m:r>
+          <m:rPr>
+            <m:sty m:val="p"/>
+          </m:rPr>
+          <m:t>=</m:t>
+        </m:r>
+        <m:r>
+          <m:t>12</m:t>
+        </m:r>
+      </m:oMath>
+      <w:r>
+        <w:t xml:space="preserve"> </w:t>
+      </w:r>
+      <w:r>
+        <w:t xml:space="preserve">negative controls, and plug-in calibrated p-values at this sample size are mildly anti-conservative (Type I error 11.4% versus the nominal 5% in our simulation; eAppendix 13). We therefore report a small-sample t-predictive sensitivity for the GDMT comparison. Under the t-reference distribution the GDMT calibrated p-value moved from 0.0066 (plug-in) to 0.0270 (t-predictive, df =</w:t>
+      </w:r>
+      <w:r>
+        <w:t xml:space="preserve"> </w:t>
+      </w:r>
+      <m:oMath>
+        <m:r>
+          <m:t>K</m:t>
+        </m:r>
+        <m:r>
+          <m:rPr>
+            <m:sty m:val="p"/>
+          </m:rPr>
+          <m:t>−</m:t>
+        </m:r>
+        <m:r>
+          <m:t>2</m:t>
+        </m:r>
+      </m:oMath>
+      <w:r>
+        <w:t xml:space="preserve">); the value remains below 0.05 but is materially closer to the threshold. A 2000-replicate resampling bootstrap of the 12 controls showed the GDMT plug-in p-value to be 95.9% below 0.05 across resamples (95% PI, 0.000 to 0.065), so the qualitative conclusion is robust under control resampling; the BB plug-in p-value was below 0.05 in 0% of resamples (95% PI, 0.444 to 0.989). Both point estimates and CIs should be read in light of the moderate precision afforded by</w:t>
+      </w:r>
+      <w:r>
+        <w:t xml:space="preserve"> </w:t>
+      </w:r>
+      <m:oMath>
+        <m:r>
+          <m:t>K</m:t>
+        </m:r>
+        <m:r>
+          <m:rPr>
+            <m:sty m:val="p"/>
+          </m:rPr>
+          <m:t>=</m:t>
+        </m:r>
+        <m:r>
+          <m:t>12</m:t>
+        </m:r>
+      </m:oMath>
+      <w:r>
+        <w:t xml:space="preserve">.</w:t>
       </w:r>
     </w:p>
     <w:p>
@@ -8431,7 +8834,7 @@
     </w:p>
     <w:bookmarkEnd w:id="56"/>
     <w:bookmarkEnd w:id="57"/>
-    <w:bookmarkStart w:id="101" w:name="references"/>
+    <w:bookmarkStart w:id="103" w:name="references"/>
     <w:p>
       <w:pPr>
         <w:pStyle w:val="Heading1"/>
@@ -8440,7 +8843,7 @@
         <w:t xml:space="preserve">References</w:t>
       </w:r>
     </w:p>
-    <w:bookmarkStart w:id="100" w:name="refs"/>
+    <w:bookmarkStart w:id="102" w:name="refs"/>
     <w:bookmarkStart w:id="59" w:name="ref-ren2026tte"/>
     <w:p>
       <w:pPr>
@@ -9736,8 +10139,48 @@
       </w:hyperlink>
     </w:p>
     <w:bookmarkEnd w:id="99"/>
-    <w:bookmarkEnd w:id="100"/>
+    <w:bookmarkStart w:id="101" w:name="ref-higgins2009reevaluation"/>
+    <w:p>
+      <w:pPr>
+        <w:pStyle w:val="Bibliography"/>
+      </w:pPr>
+      <w:r>
+        <w:t xml:space="preserve">22.</w:t>
+      </w:r>
+      <w:r>
+        <w:t xml:space="preserve"> </w:t>
+      </w:r>
+      <w:r>
+        <w:t xml:space="preserve">	</w:t>
+      </w:r>
+      <w:r>
+        <w:t xml:space="preserve">Higgins JPT, Thompson SG, Spiegelhalter DJ. A re-evaluation of random-effects meta-analysis.</w:t>
+      </w:r>
+      <w:r>
+        <w:t xml:space="preserve"> </w:t>
+      </w:r>
+      <w:r>
+        <w:rPr>
+          <w:i/>
+          <w:iCs/>
+        </w:rPr>
+        <w:t xml:space="preserve">Journal of the Royal Statistical Society Series A</w:t>
+      </w:r>
+      <w:r>
+        <w:t xml:space="preserve">. 2009;172(1):137-159. doi:</w:t>
+      </w:r>
+      <w:hyperlink r:id="rId100">
+        <w:r>
+          <w:rPr>
+            <w:rStyle w:val="Hyperlink"/>
+          </w:rPr>
+          <w:t xml:space="preserve">10.1111/j.1467-985X.2008.00552.x</w:t>
+        </w:r>
+      </w:hyperlink>
+    </w:p>
     <w:bookmarkEnd w:id="101"/>
+    <w:bookmarkEnd w:id="102"/>
+    <w:bookmarkEnd w:id="103"/>
     <w:sectPr>
       <w:footnotePr>
         <w:numRestart w:val="eachSect"/>

</xml_diff>